<commit_message>
Tailored resume for: jd/rehan 24.txt
</commit_message>
<xml_diff>
--- a/output/Rehan_Malik_Resume_rehan_24.docx
+++ b/output/Rehan_Malik_Resume_rehan_24.docx
@@ -274,7 +274,7 @@
         <w:ind w:left="2115" w:leftChars="0" w:hanging="360"/>
       </w:pPr>
       <w:r>
-        <w:t>Developed and deployed real-time voice-to-data ingestion systems processing 500+ concurrent calls with zero latency using WebSockets, Apache Kafka, and streaming architectures, aligning with large-scale distributed system requirements.</w:t>
+        <w:t>Developed and deployed real-time voice-to-data ingestion engines using WebSockets, Apache Kafka, and streaming architectures, enabling zero-latency processing of 500+ concurrent calls.</w:t>
       </w:r>
     </w:p>
     <w:p>
@@ -286,7 +286,7 @@
         <w:ind w:left="2115" w:leftChars="0" w:hanging="360"/>
       </w:pPr>
       <w:r>
-        <w:t>Engineered autonomous execution platforms leveraging LangChain Agents and LLM orchestration to automate complex workflows, demonstrating expertise in Generative AI solutions.</w:t>
+        <w:t>Designed and implemented autonomous Generative AI platforms leveraging LangChain Agents and LLM orchestration to execute complex workflows without human intervention.</w:t>
       </w:r>
     </w:p>
     <w:p>
@@ -298,7 +298,7 @@
         <w:ind w:left="2115" w:leftChars="0" w:hanging="360"/>
       </w:pPr>
       <w:r>
-        <w:t>Optimized cloud data infrastructure to process 2TB+ datasets, increasing system capacity by 60% through advanced ETL pipeline optimization and data partitioning, showcasing proficiency in handling Big Data at scale.</w:t>
+        <w:t>Optimized large-scale cloud data infrastructure to process 2TB+ datasets, increasing system efficiency by 60% through advanced ETL pipelines and data partitioning techniques.</w:t>
       </w:r>
     </w:p>
     <w:p>
@@ -310,7 +310,7 @@
         <w:ind w:left="2115" w:leftChars="0" w:hanging="360"/>
       </w:pPr>
       <w:r>
-        <w:t>Designed and implemented scalable cloud architectures on AWS (ECS, Lambda, S3, RDS) and GCP, tailored for high-performance Generative AI and ML workloads.</w:t>
+        <w:t>Engineered scalable cloud architectures on AWS (ECS, Lambda, S3, RDS) and GCP to support high-performance Generative AI and Machine Learning workloads.</w:t>
       </w:r>
     </w:p>
     <w:p>
@@ -322,7 +322,7 @@
         <w:ind w:left="2115" w:leftChars="0" w:hanging="360"/>
       </w:pPr>
       <w:r>
-        <w:t>Developed gRPC microservices with C++ modules (CUDA, Eigen) to reduce model inference latency by 25% and support 15% more concurrent users, exemplifying expertise in production-ready ML systems.</w:t>
+        <w:t>Developed high-performance gRPC microservices with C++ (CUDA, Eigen), reducing model inference latency by 25% and enabling support for 15% more concurrent users.</w:t>
       </w:r>
     </w:p>
     <w:p>
@@ -334,7 +334,7 @@
         <w:ind w:left="2115" w:leftChars="0" w:hanging="360"/>
       </w:pPr>
       <w:r>
-        <w:t>Created Retrieval-Augmented Generation (RAG) pipelines using LangChain, FAISS, and ChromaDB to enable efficient enterprise knowledge retrieval from diverse data sources.</w:t>
+        <w:t>Designed and implemented Retrieval-Augmented Generation (RAG) pipelines using LangChain, FAISS, and ChromaDB for enterprise-grade knowledge retrieval across diverse data sources.</w:t>
       </w:r>
     </w:p>
     <w:p>
@@ -346,7 +346,7 @@
         <w:ind w:left="2115" w:leftChars="0" w:hanging="360"/>
       </w:pPr>
       <w:r>
-        <w:t>Enhanced LLM performance and reliability for production Generative AI applications by implementing Reinforcement Learning with Human Feedback (RLHF) using PPO frameworks.</w:t>
+        <w:t>Applied Reinforcement Learning with Human Feedback (RLHF) using PPO to enhance the performance and reliability of production-grade LLMs for Generative AI applications.</w:t>
       </w:r>
     </w:p>
     <w:p>
@@ -358,7 +358,7 @@
         <w:ind w:left="2115" w:leftChars="0" w:hanging="360"/>
       </w:pPr>
       <w:r>
-        <w:t>Built real-time audio processing pipelines on AWS for speech-to-text, sentiment analysis, and sales insights, demonstrating advanced streaming architecture capabilities.</w:t>
+        <w:t>Built real-time audio processing pipelines for speech-to-text, sentiment analysis, and actionable insights using streaming architectures on AWS.</w:t>
       </w:r>
     </w:p>
     <w:p>
@@ -459,7 +459,7 @@
         <w:ind w:left="2115" w:leftChars="0" w:hanging="360"/>
       </w:pPr>
       <w:r>
-        <w:t>Led the design and implementation of Generative AI solutions, including data architectures and orchestration patterns, driving a $1M+ enterprise transformation in regulated environments.</w:t>
+        <w:t>Pioneered a $1M+ Generative AI transformation initiative, developing data architectures and orchestration frameworks tailored for regulated environments.</w:t>
       </w:r>
     </w:p>
     <w:p>
@@ -471,7 +471,7 @@
         <w:ind w:left="2115" w:leftChars="0" w:hanging="360"/>
       </w:pPr>
       <w:r>
-        <w:t>Developed and deployed GenAI data pipelines to process and structure business documents into technical assets using advanced LLM orchestration techniques.</w:t>
+        <w:t>Designed and implemented GenAI data pipelines, transforming unstructured business documents into structured assets using advanced LLM orchestration techniques.</w:t>
       </w:r>
     </w:p>
     <w:p>
@@ -483,7 +483,7 @@
         <w:ind w:left="2115" w:leftChars="0" w:hanging="360"/>
       </w:pPr>
       <w:r>
-        <w:t>Evaluated and integrated Generative AI frameworks like LangChain and multi-agent systems, ensuring compatibility with cloud-based distributed systems in compliance-driven industries.</w:t>
+        <w:t>Evaluated and deployed Generative AI orchestration frameworks, including LangChain and multi-agent systems, optimized for large-scale cloud-based environments.</w:t>
       </w:r>
     </w:p>
     <w:p>
@@ -495,7 +495,7 @@
         <w:ind w:left="2115" w:leftChars="0" w:hanging="360"/>
       </w:pPr>
       <w:r>
-        <w:t>Engineered multi-stage delivery frameworks with robust data lineage and governance, meeting audit and traceability requirements for production-grade ML solutions.</w:t>
+        <w:t>Developed multi-stage delivery frameworks with comprehensive data lineage to uphold governance and compliance standards for enterprise GenAI solutions.</w:t>
       </w:r>
     </w:p>
     <w:p>
@@ -507,7 +507,7 @@
         <w:ind w:left="2115" w:leftChars="0" w:hanging="360"/>
       </w:pPr>
       <w:r>
-        <w:t>Designed and implemented Retrieval-Augmented Generation (RAG) architectures to enhance LLM outputs with accurate, domain-specific knowledge for enterprise use cases.</w:t>
+        <w:t>Engineered Retrieval-Augmented Generation (RAG) architectures to ground LLM outputs in factual, domain-specific knowledge for regulated use cases.</w:t>
       </w:r>
     </w:p>
     <w:p>
@@ -519,7 +519,7 @@
         <w:ind w:left="2115" w:leftChars="0" w:hanging="360"/>
       </w:pPr>
       <w:r>
-        <w:t>Collaborated with cross-functional teams to lead human-in-the-loop validation processes, ensuring the safe and effective adoption of AI-generated outputs in production systems.</w:t>
+        <w:t>Collaborated with cross-functional teams and led validation sessions to ensure safe and effective integration of AI-generated outputs into production workflows.</w:t>
       </w:r>
     </w:p>
     <w:p>
@@ -778,7 +778,7 @@
         <w:ind w:left="720" w:leftChars="0" w:firstLine="720" w:firstLineChars="0"/>
       </w:pPr>
       <w:r>
-        <w:t xml:space="preserve">Cloud &amp; ML Solution Architect </w:t>
+        <w:t xml:space="preserve">Cloud ML Solution Architect </w:t>
       </w:r>
     </w:p>
     <w:p>
@@ -790,7 +790,7 @@
         <w:ind w:left="2115" w:leftChars="0" w:hanging="360"/>
       </w:pPr>
       <w:r>
-        <w:t>Developed and deployed scalable cloud-native AI and ML solutions on AWS, Azure, and GCP, addressing complex business challenges for enterprise clients.</w:t>
+        <w:t>Developed scalable cloud-native AI and ML solutions on AWS, Azure, and GCP, addressing complex business challenges for enterprise clients.</w:t>
       </w:r>
     </w:p>
     <w:p>
@@ -802,7 +802,7 @@
         <w:ind w:left="2115" w:leftChars="0" w:hanging="360"/>
       </w:pPr>
       <w:r>
-        <w:t>Engineered and integrated AI-driven automation tools and data pipelines, optimizing compatibility with existing enterprise data ecosystems.</w:t>
+        <w:t>Designed and implemented AI-driven automation tools and data pipelines, ensuring compatibility with large-scale enterprise data ecosystems.</w:t>
       </w:r>
     </w:p>
     <w:p>
@@ -814,7 +814,7 @@
         <w:ind w:left="2115" w:leftChars="0" w:hanging="360"/>
       </w:pPr>
       <w:r>
-        <w:t>Designed and implemented advanced ETL/ELT workflows, cloud data migration strategies, and real-time data processing pipelines to support large-scale distributed systems.</w:t>
+        <w:t>Engineered real-time data processing pipelines and ETL/ELT workflows, optimizing automation strategies for cloud-based environments.</w:t>
       </w:r>
     </w:p>
     <w:p>
@@ -826,7 +826,7 @@
         <w:ind w:left="2115" w:leftChars="0" w:hanging="360"/>
       </w:pPr>
       <w:r>
-        <w:t>Collaborated with stakeholders through regular reviews to align cloud infrastructure, data architecture roadmaps, and automation strategies with business objectives.</w:t>
+        <w:t>Collaborated with stakeholders to align cloud infrastructure and data architecture roadmaps with strategic ML initiatives during weekly reviews.</w:t>
       </w:r>
     </w:p>
     <w:p>
@@ -838,7 +838,7 @@
         <w:ind w:left="2115" w:leftChars="0" w:hanging="360"/>
       </w:pPr>
       <w:r>
-        <w:t>Ensured robust security and performance standards for cloud-based data deployments, streamlining operations and reducing manual intervention.</w:t>
+        <w:t>Ensured compliance with security and performance standards across cloud ML deployments, significantly reducing manual operational tasks.</w:t>
       </w:r>
     </w:p>
     <w:p>
@@ -1020,7 +1020,7 @@
         <w:ind w:left="1360"/>
       </w:pPr>
       <w:r>
-        <w:t xml:space="preserve">Senior ML Engineer – Generative AI </w:t>
+        <w:t xml:space="preserve">Senior Machine Learning &amp; AI Engineer </w:t>
       </w:r>
     </w:p>
     <w:p>
@@ -1032,7 +1032,7 @@
         <w:ind w:left="2115" w:leftChars="0" w:hanging="360"/>
       </w:pPr>
       <w:r>
-        <w:t>Developed scalable Retrieval-Augmented Generation (RAG) pipelines using LangChain, FAISS, and ChromaDB to enable context-aware enterprise search across large-scale document repositories exceeding 2TB.</w:t>
+        <w:t>Developed scalable Retrieval-Augmented Generation (RAG) pipelines using LangChain, FAISS, and ChromaDB to enable context-aware enterprise search across 2TB+ document repositories.</w:t>
       </w:r>
     </w:p>
     <w:p>
@@ -1044,7 +1044,7 @@
         <w:ind w:left="2115" w:leftChars="0" w:hanging="360"/>
       </w:pPr>
       <w:r>
-        <w:t>Designed and implemented end-to-end data pipelines for ingestion, transformation, validation, and model serving using Python, PySpark, and Airflow, supporting large-scale distributed systems.</w:t>
+        <w:t>Designed and implemented end-to-end data pipelines, including ingestion, transformation, validation, and model serving, leveraging Python, PySpark, and Airflow for production-grade ML workflows.</w:t>
       </w:r>
     </w:p>
     <w:p>
@@ -1056,7 +1056,7 @@
         <w:ind w:left="2115" w:leftChars="0" w:hanging="360"/>
       </w:pPr>
       <w:r>
-        <w:t>Deployed fine-tuned large language models (LLaMA, Mistral) using techniques like LoRA, QLoRA, and PEFT on AWS SageMaker, achieving a 40% reduction in API costs compared to hosted models.</w:t>
+        <w:t>Deployed fine-tuned large language models (LLaMA, Mistral) with techniques like LoRA, QLoRA, and PEFT on AWS SageMaker, achieving a 40% reduction in API costs compared to hosted models.</w:t>
       </w:r>
     </w:p>
     <w:p>
@@ -1068,7 +1068,7 @@
         <w:ind w:left="2115" w:leftChars="0" w:hanging="360"/>
       </w:pPr>
       <w:r>
-        <w:t>Optimized model serving at scale using VLLM with GPU acceleration via CUDA, containerized with Docker, and deployed on AWS ECS/ECR for real-time performance.</w:t>
+        <w:t>Served high-performance ML models at scale using VLLM with optimized GPU utilization via CUDA, containerized with Docker, and deployed on AWS ECS/ECR for real-time applications.</w:t>
       </w:r>
     </w:p>
     <w:p>
@@ -1080,7 +1080,7 @@
         <w:ind w:left="2115" w:leftChars="0" w:hanging="360"/>
       </w:pPr>
       <w:r>
-        <w:t>Engineered intelligent AI agent workflows by integrating LLMs with internal APIs, databases, and messaging platforms to enable autonomous task execution.</w:t>
+        <w:t>Built intelligent AI agent workflows by integrating LLMs with internal APIs, databases, and messaging platforms to enable autonomous task execution and multi-agent interactions.</w:t>
       </w:r>
     </w:p>
     <w:p>
@@ -1092,7 +1092,7 @@
         <w:ind w:left="2115" w:leftChars="0" w:hanging="360"/>
       </w:pPr>
       <w:r>
-        <w:t>Enhanced inference pipelines with C++ modules to improve computational efficiency, achieving a 25% reduction in model latency.</w:t>
+        <w:t>Optimized inference pipelines by integrating C++ modules, reducing model latency by 25% and improving system responsiveness for real-time use cases.</w:t>
       </w:r>
     </w:p>
     <w:p>
@@ -1104,7 +1104,7 @@
         <w:ind w:left="2115" w:leftChars="0" w:hanging="360"/>
       </w:pPr>
       <w:r>
-        <w:t>Developed real-time audio processing and speech-to-text pipelines to support streaming architectures, leveraging advanced machine learning techniques.</w:t>
+        <w:t>Developed real-time audio processing and speech-to-text pipelines to support streaming architectures, enhancing data accessibility and analysis.</w:t>
       </w:r>
     </w:p>
     <w:p>
@@ -1116,7 +1116,7 @@
         <w:ind w:left="2115" w:leftChars="0" w:hanging="360"/>
       </w:pPr>
       <w:r>
-        <w:t>Built high-performance conversational AI APIs powered by OpenAI, achieving a 35% improvement in response times for enhanced user experience.</w:t>
+        <w:t>Created high-performance conversational APIs powered by OpenAI, reducing response times by 35% and improving user experience for interactive applications.</w:t>
       </w:r>
     </w:p>
     <w:p>
@@ -1281,7 +1281,7 @@
         <w:ind w:left="1360"/>
       </w:pPr>
       <w:r>
-        <w:t xml:space="preserve">Senior Machine Learning Engineer – GenAI </w:t>
+        <w:t xml:space="preserve">Senior Machine Learning Engineer – Generative AI </w:t>
       </w:r>
     </w:p>
     <w:p>
@@ -1293,7 +1293,7 @@
         <w:ind w:left="2115" w:leftChars="0" w:hanging="360"/>
       </w:pPr>
       <w:r>
-        <w:t>Developed and optimized large-scale ETL pipelines to ensure data quality, reliability, and timely model retraining, supporting high-revenue accounts exceeding $200K in monthly revenue.</w:t>
+        <w:t>Optimized and managed large-scale ETL pipelines to ensure data quality, reliability, and timely retraining of ML models, supporting high-revenue accounts exceeding $200K monthly.</w:t>
       </w:r>
     </w:p>
     <w:p>
@@ -1305,7 +1305,7 @@
         <w:ind w:left="2115" w:leftChars="0" w:hanging="360"/>
       </w:pPr>
       <w:r>
-        <w:t>Assessed and improved data quality, pipeline performance, and model accuracy to meet complex client requirements for accounts generating over $1M in revenue.</w:t>
+        <w:t>Assessed data quality, pipeline efficiency, and model performance, delivering scalable ML solutions tailored to meet the needs of accounts generating over $1M in revenue.</w:t>
       </w:r>
     </w:p>
     <w:p>
@@ -1317,7 +1317,7 @@
         <w:ind w:left="2115" w:leftChars="0" w:hanging="360"/>
       </w:pPr>
       <w:r>
-        <w:t>Directed feature engineering and data generation processes to support machine learning projects, ensuring high-quality training data for scalable model development.</w:t>
+        <w:t>Directed feature engineering and data generation processes to support ML model development, ensuring high-quality training data availability for production-grade solutions.</w:t>
       </w:r>
     </w:p>
     <w:p>
@@ -1329,7 +1329,7 @@
         <w:ind w:left="2115" w:leftChars="0" w:hanging="360"/>
       </w:pPr>
       <w:r>
-        <w:t>Designed and implemented real-time data analysis workflows using SQL, PostgreSQL, Grafana, and Tableau to monitor and report on production performance.</w:t>
+        <w:t>Developed and maintained real-time data analysis and monitoring workflows using SQL, PostgreSQL, Grafana, and Tableau to support critical ML operations.</w:t>
       </w:r>
     </w:p>
     <w:p>
@@ -1341,7 +1341,7 @@
         <w:ind w:left="2115" w:leftChars="0" w:hanging="360"/>
       </w:pPr>
       <w:r>
-        <w:t>Collaborated with cross-functional teams to manage end-to-end ML lifecycle, leveraging tools like Jira, Slack, and Trello in a high-availability production environment.</w:t>
+        <w:t>Collaborated with multidisciplinary teams in a high-availability environment, leveraging tools like Jira, Slack, and Trello to streamline ML development and deployment workflows.</w:t>
       </w:r>
     </w:p>
     <w:p>
@@ -1525,7 +1525,7 @@
         <w:ind w:left="2115" w:leftChars="0" w:hanging="360"/>
       </w:pPr>
       <w:r>
-        <w:t>Maintained and optimized production ML pipelines and operations, ensuring high availability and data integrity across large-scale enterprise systems.</w:t>
+        <w:t>Maintained and monitored production ML pipelines and operations, ensuring high availability and data integrity across distributed systems.</w:t>
       </w:r>
     </w:p>
     <w:p>
@@ -1537,7 +1537,7 @@
         <w:ind w:left="2115" w:leftChars="0" w:hanging="360"/>
       </w:pPr>
       <w:r>
-        <w:t>Developed and deployed predictive ML models for churn risk analysis, integrating them into decision-making systems to enhance operational efficiency and outcomes.</w:t>
+        <w:t>Developed and deployed predictive ML models, including churn risk models, to optimize decision-making and enhance operational efficiency.</w:t>
       </w:r>
     </w:p>
     <w:p>
@@ -1549,7 +1549,7 @@
         <w:ind w:left="2115" w:leftChars="0" w:hanging="360"/>
       </w:pPr>
       <w:r>
-        <w:t>Performed real-time data analysis using SQL, PostgreSQL, Grafana, and Tableau, supporting anomaly detection and operational insights at scale.</w:t>
+        <w:t>Performed advanced data analysis using SQL, PostgreSQL, and visualization tools to support real-time monitoring and anomaly detection.</w:t>
       </w:r>
     </w:p>
     <w:p>
@@ -1561,7 +1561,7 @@
         <w:ind w:left="2115" w:leftChars="0" w:hanging="360"/>
       </w:pPr>
       <w:r>
-        <w:t>Streamlined incident management processes through JIRA, collaborating with cross-functional teams to ensure rapid resolution and system reliability.</w:t>
+        <w:t>Streamlined incident management for ML workflows using JIRA, collaborating with cross-functional teams to ensure rapid issue resolution.</w:t>
       </w:r>
     </w:p>
     <w:p>
@@ -1720,7 +1720,7 @@
         <w:ind w:left="1360"/>
       </w:pPr>
       <w:r>
-        <w:t xml:space="preserve">Junior ML &amp; Data Engineer </w:t>
+        <w:t xml:space="preserve">Junior Machine Learning &amp; Data Engineer </w:t>
       </w:r>
     </w:p>
     <w:p>
@@ -1732,7 +1732,7 @@
         <w:ind w:left="2115" w:leftChars="0" w:hanging="360"/>
       </w:pPr>
       <w:r>
-        <w:t>Designed and implemented scalable data pipelines to ingest, transform, and analyze large-scale IoT sensor data, enabling real-time insights for connected devices.</w:t>
+        <w:t>Designed and implemented scalable data pipelines to ingest, transform, and analyze large-scale IoT sensor data, supporting real-time insights.</w:t>
       </w:r>
     </w:p>
     <w:p>
@@ -1744,7 +1744,7 @@
         <w:ind w:left="2115" w:leftChars="0" w:hanging="360"/>
       </w:pPr>
       <w:r>
-        <w:t>Developed and optimized analytical workflows using Python, PostgreSQL, and MySQL to uncover patterns, trends, and anomalies in complex IoT datasets.</w:t>
+        <w:t>Developed and optimized analytical workflows using Python, PostgreSQL, and MySQL to uncover patterns, trends, and anomalies in complex datasets.</w:t>
       </w:r>
     </w:p>
     <w:p>
@@ -1756,7 +1756,7 @@
         <w:ind w:left="2115" w:leftChars="0" w:hanging="360"/>
       </w:pPr>
       <w:r>
-        <w:t>Created interactive data visualizations and dashboards in Power BI to support data-driven decision-making and strategic planning for stakeholders.</w:t>
+        <w:t>Created interactive data visualizations and dashboards in Power BI to enable data-driven decision-making for cross-functional stakeholders.</w:t>
       </w:r>
     </w:p>
     <w:p>
@@ -1768,7 +1768,7 @@
         <w:ind w:left="2115" w:leftChars="0" w:hanging="360"/>
       </w:pPr>
       <w:r>
-        <w:t>Applied machine learning techniques, including clustering and anomaly detection, to IoT time-series data, driving predictive maintenance and operational efficiency.</w:t>
+        <w:t>Applied machine learning techniques, including clustering and anomaly detection, to IoT time-series data, driving predictive maintenance solutions.</w:t>
       </w:r>
     </w:p>
     <w:p>
@@ -2084,10 +2084,42 @@
         <w:rPr>
           <w:b/>
         </w:rPr>
+        <w:t xml:space="preserve">GenAI &amp; LLMs: </w:t>
+      </w:r>
+      <w:r>
+        <w:t>RAG Architectures, LangChain, Fine-Tuning (LoRA, QLoRA, PEFT), Agentic AI, OpenAI, Claude/Anthropic, LLaMA, Mistral, Hugging Face, VLLM, Prompt Engineering, FAISS, ChromaDB, Pinecone, PG-Vector.</w:t>
+      </w:r>
+      <w:r>
+        <w:rPr>
+          <w:b/>
+        </w:rPr>
+        <w:t xml:space="preserve"> </w:t>
+      </w:r>
+      <w:r>
+        <w:rPr>
+          <w:b/>
+        </w:rPr>
+        <w:br w:type="textWrapping"/>
+      </w:r>
+    </w:p>
+    <w:p>
+      <w:pPr>
+        <w:ind w:left="1350" w:hanging="1350"/>
+      </w:pPr>
+      <w:r>
+        <w:t xml:space="preserve"> </w:t>
+      </w:r>
+      <w:r>
+        <w:tab/>
+      </w:r>
+      <w:r>
+        <w:rPr>
+          <w:b/>
+        </w:rPr>
         <w:t xml:space="preserve">Core ML &amp; AI: </w:t>
       </w:r>
       <w:r>
-        <w:t>PyTorch, TensorFlow, scikit-learn, Python, C++, RLHF, PPO, CUDA, Quantization, OpenCV, FastAPI, Flask, gRPC, REST APIs, WebSockets, Shell Scripting.</w:t>
+        <w:t>PyTorch, TensorFlow, scikit-learn, Python, C++, RLHF, PPO, CUDA, Quantization, FastAPI, Flask, gRPC, REST APIs, WebSockets, Shell Scripting, OpenCV.</w:t>
       </w:r>
       <w:r>
         <w:rPr>
@@ -2116,10 +2148,10 @@
         <w:rPr>
           <w:b/>
         </w:rPr>
-        <w:t xml:space="preserve">GenAI &amp; LLMs: </w:t>
-      </w:r>
-      <w:r>
-        <w:t>RAG Architectures, LangChain, Fine-Tuning (LoRA, QLoRA, PEFT), Agentic AI, Prompt Engineering, OpenAI, Claude/Anthropic, LLaMA, Mistral, Hugging Face, VLLM, FAISS, ChromaDB, Pinecone, PG-Vector.</w:t>
+        <w:t xml:space="preserve">AWS &amp; Cloud: </w:t>
+      </w:r>
+      <w:r>
+        <w:t>AWS (SageMaker, ECS, Lambda, ECR, S3, RDS), GCP, Azure, Docker, Kubernetes, Terraform, CI/CD, Microservices.</w:t>
       </w:r>
       <w:r>
         <w:rPr>
@@ -2148,42 +2180,10 @@
         <w:rPr>
           <w:b/>
         </w:rPr>
-        <w:t xml:space="preserve">AWS &amp; Cloud: </w:t>
-      </w:r>
-      <w:r>
-        <w:t>AWS (SageMaker, ECS, ECR, Lambda, S3, RDS), GCP, Azure, Docker, Kubernetes, Terraform, CI/CD, Microservices.</w:t>
-      </w:r>
-      <w:r>
-        <w:rPr>
-          <w:b/>
-        </w:rPr>
-        <w:t xml:space="preserve"> </w:t>
-      </w:r>
-      <w:r>
-        <w:rPr>
-          <w:b/>
-        </w:rPr>
-        <w:br w:type="textWrapping"/>
-      </w:r>
-    </w:p>
-    <w:p>
-      <w:pPr>
-        <w:ind w:left="1350" w:hanging="1350"/>
-      </w:pPr>
-      <w:r>
-        <w:t xml:space="preserve"> </w:t>
-      </w:r>
-      <w:r>
-        <w:tab/>
-      </w:r>
-      <w:r>
-        <w:rPr>
-          <w:b/>
-        </w:rPr>
         <w:t xml:space="preserve">Data Engineering: </w:t>
       </w:r>
       <w:r>
-        <w:t>PySpark, Apache Kafka, Apache Airflow, ETL/ELT Pipelines, Real-Time Streaming, dbt, Data Warehousing, PostgreSQL, MongoDB, Redis, MySQL, DynamoDB, SQL, Data Modeling, Data Quality, Grafana, Tableau, Power BI.</w:t>
+        <w:t>PySpark, Apache Kafka, Apache Airflow, ETL/ELT Pipelines, Data Warehousing, Real-Time Streaming, dbt, PostgreSQL, MongoDB, Redis, MySQL, DynamoDB, SQL, Grafana, Tableau, Power BI, Data Modeling, Data Quality.</w:t>
       </w:r>
       <w:r>
         <w:rPr>

</xml_diff>